<commit_message>
fix(sales): isRental detection — itContractId/tmRentalId 직접 연결 시도 RENTAL 로 인식
</commit_message>
<xml_diff>
--- a/docs/manual/텔러스테크_ERP_고객포탈가이드_BookC.docx
+++ b/docs/manual/텔러스테크_ERP_고객포탈가이드_BookC.docx
@@ -978,6 +978,476 @@
           <w:szCs w:val="22"/>
         </w:rPr>
         <w:t xml:space="preserve">비밀번호를 잊으신 경우 Tellustech 담당자에게 연락해 재설정을 요청해 주세요. 보안상 자가 재설정은 제공하지 않습니다 (포탈에서는 이메일 기반 재설정 링크를 발송하지 않습니다 — 사칭 방지 목적).</w:t>
+      </w:r>
+    </w:p>
+    <w:p>
+      <w:r>
+        <w:br w:type="page"/>
+      </w:r>
+    </w:p>
+    <w:p>
+      <w:pPr>
+        <w:pStyle w:val="Heading1"/>
+      </w:pPr>
+      <w:r>
+        <w:t xml:space="preserve">1.4.5 회원 정책 (NEW)</w:t>
+      </w:r>
+    </w:p>
+    <w:p>
+      <w:pPr>
+        <w:pStyle w:val="Heading2"/>
+      </w:pPr>
+      <w:r>
+        <w:t xml:space="preserve">한 거래처 = 한 개의 포탈 ID</w:t>
+      </w:r>
+    </w:p>
+    <w:p>
+      <w:pPr>
+        <w:spacing w:after="120"/>
+      </w:pPr>
+      <w:r>
+        <w:rPr>
+          <w:rFonts w:ascii="Malgun Gothic" w:cs="Malgun Gothic" w:eastAsia="Malgun Gothic" w:hAnsi="Malgun Gothic"/>
+          <w:sz w:val="22"/>
+          <w:szCs w:val="22"/>
+        </w:rPr>
+        <w:t xml:space="preserve">귀사(거래처)에 발급되는 포탈 로그인 ID는 한 개입니다. 한 회사 내 여러 담당자가 함께 사용할 경우, 비밀번호와 ID는 IT 담당자 한 명이 관리하시고 필요 시 공유해 주세요.</w:t>
+      </w:r>
+    </w:p>
+    <w:p>
+      <w:pPr>
+        <w:pBdr>
+          <w:left w:val="single" w:color="E67E22" w:sz="8" w:space="8"/>
+        </w:pBdr>
+        <w:spacing w:after="120" w:before="80"/>
+        <w:ind w:left="360"/>
+      </w:pPr>
+      <w:r>
+        <w:rPr>
+          <w:rFonts w:ascii="Malgun Gothic" w:cs="Malgun Gothic" w:eastAsia="Malgun Gothic" w:hAnsi="Malgun Gothic"/>
+          <w:i/>
+          <w:iCs/>
+          <w:color w:val="7F8C8D"/>
+          <w:sz w:val="20"/>
+          <w:szCs w:val="20"/>
+        </w:rPr>
+        <w:t xml:space="preserve">왜 한 개만 발급하나요? AS·소모품 요청·견적 요청·서베이 등 모든 활동이 한 거래처 단위로 누적됩니다. 여러 ID를 발급하면 같은 활동에 중복 적립되거나, 분산되어 책임 추적이 어려워집니다. 또한 포인트는 거래처(회사) 자산으로 처리되어 청구액 차감 등 회사 단위 사용으로 통합됩니다.</w:t>
+      </w:r>
+    </w:p>
+    <w:p>
+      <w:pPr>
+        <w:pStyle w:val="Heading2"/>
+      </w:pPr>
+      <w:r>
+        <w:t xml:space="preserve">자가 회원가입 없음</w:t>
+      </w:r>
+    </w:p>
+    <w:p>
+      <w:pPr>
+        <w:spacing w:after="120"/>
+      </w:pPr>
+      <w:r>
+        <w:rPr>
+          <w:rFonts w:ascii="Malgun Gothic" w:cs="Malgun Gothic" w:eastAsia="Malgun Gothic" w:hAnsi="Malgun Gothic"/>
+          <w:sz w:val="22"/>
+          <w:szCs w:val="22"/>
+        </w:rPr>
+        <w:t xml:space="preserve">포탈은 관리자 발급 방식 입니다. 신규 거래처 등록 시 Tellustech 가 ID를 발급하여 IT 담당자에게 전달합니다. 비밀번호 분실 시 자가 재설정은 제공하지 않으며, 담당자에게 연락하셔서 재발급 받으세요 (사칭 방지 목적).</w:t>
+      </w:r>
+    </w:p>
+    <w:p>
+      <w:pPr>
+        <w:pStyle w:val="Heading2"/>
+      </w:pPr>
+      <w:r>
+        <w:t xml:space="preserve">포인트는 거래처 자산</w:t>
+      </w:r>
+    </w:p>
+    <w:p>
+      <w:pPr>
+        <w:spacing w:after="120"/>
+      </w:pPr>
+      <w:r>
+        <w:rPr>
+          <w:rFonts w:ascii="Malgun Gothic" w:cs="Malgun Gothic" w:eastAsia="Malgun Gothic" w:hAnsi="Malgun Gothic"/>
+          <w:sz w:val="22"/>
+          <w:szCs w:val="22"/>
+        </w:rPr>
+        <w:t xml:space="preserve">한 명의 직원이 견적을 요청해 +1,000d 가 적립되든, 다른 직원이 서베이에 응답해 +10,000d 가 적립되든, 모두 거래처 잔액 한 곳으로 누적됩니다. 사용 시에도 회사 단위로 사용됩니다 (개인이 가져갈 수 없음).</w:t>
+      </w:r>
+    </w:p>
+    <w:p>
+      <w:pPr>
+        <w:pStyle w:val="Heading2"/>
+      </w:pPr>
+      <w:r>
+        <w:t xml:space="preserve">포인트 사용 정책 — 계약 시 결정 (NEW)</w:t>
+      </w:r>
+    </w:p>
+    <w:p>
+      <w:pPr>
+        <w:spacing w:after="120"/>
+      </w:pPr>
+      <w:r>
+        <w:rPr>
+          <w:rFonts w:ascii="Malgun Gothic" w:cs="Malgun Gothic" w:eastAsia="Malgun Gothic" w:hAnsi="Malgun Gothic"/>
+          <w:sz w:val="22"/>
+          <w:szCs w:val="22"/>
+        </w:rPr>
+        <w:t xml:space="preserve">대기업 컴플라이언스 (개인 상품권 수령 금지 등) 대응을 위해, 포인트 사용 방식은 계약 시점에 결정됩니다.</w:t>
+      </w:r>
+    </w:p>
+    <w:tbl>
+      <w:tblPr>
+        <w:tblW w:type="dxa" w:w="9026"/>
+        <w:tblBorders>
+          <w:top w:val="single" w:color="auto" w:sz="4"/>
+          <w:left w:val="single" w:color="auto" w:sz="4"/>
+          <w:bottom w:val="single" w:color="auto" w:sz="4"/>
+          <w:right w:val="single" w:color="auto" w:sz="4"/>
+          <w:insideH w:val="single" w:color="auto" w:sz="4"/>
+          <w:insideV w:val="single" w:color="auto" w:sz="4"/>
+        </w:tblBorders>
+      </w:tblPr>
+      <w:tblGrid>
+        <w:gridCol w:w="4513"/>
+        <w:gridCol w:w="4513"/>
+      </w:tblGrid>
+      <w:tr>
+        <w:trPr>
+          <w:tblHeader/>
+        </w:trPr>
+        <w:tc>
+          <w:tcPr>
+            <w:tcW w:type="dxa" w:w="4513"/>
+            <w:tcBorders>
+              <w:top w:val="single" w:color="D5D8DC" w:sz="1"/>
+              <w:left w:val="single" w:color="D5D8DC" w:sz="1"/>
+              <w:bottom w:val="single" w:color="D5D8DC" w:sz="1"/>
+              <w:right w:val="single" w:color="D5D8DC" w:sz="1"/>
+            </w:tcBorders>
+            <w:shd w:fill="1B4F72" w:val="clear"/>
+            <w:tcMar>
+              <w:top w:type="dxa" w:w="60"/>
+              <w:left w:type="dxa" w:w="100"/>
+              <w:bottom w:type="dxa" w:w="60"/>
+              <w:right w:type="dxa" w:w="100"/>
+            </w:tcMar>
+            <w:vAlign w:val="center"/>
+          </w:tcPr>
+          <w:p>
+            <w:pPr>
+              <w:jc w:val="center"/>
+            </w:pPr>
+            <w:r>
+              <w:rPr>
+                <w:rFonts w:ascii="Malgun Gothic" w:cs="Malgun Gothic" w:eastAsia="Malgun Gothic" w:hAnsi="Malgun Gothic"/>
+                <w:b/>
+                <w:bCs/>
+                <w:color w:val="FFFFFF"/>
+                <w:sz w:val="20"/>
+                <w:szCs w:val="20"/>
+              </w:rPr>
+              <w:t xml:space="preserve">정책</w:t>
+            </w:r>
+          </w:p>
+        </w:tc>
+        <w:tc>
+          <w:tcPr>
+            <w:tcW w:type="dxa" w:w="4513"/>
+            <w:tcBorders>
+              <w:top w:val="single" w:color="D5D8DC" w:sz="1"/>
+              <w:left w:val="single" w:color="D5D8DC" w:sz="1"/>
+              <w:bottom w:val="single" w:color="D5D8DC" w:sz="1"/>
+              <w:right w:val="single" w:color="D5D8DC" w:sz="1"/>
+            </w:tcBorders>
+            <w:shd w:fill="1B4F72" w:val="clear"/>
+            <w:tcMar>
+              <w:top w:type="dxa" w:w="60"/>
+              <w:left w:type="dxa" w:w="100"/>
+              <w:bottom w:type="dxa" w:w="60"/>
+              <w:right w:type="dxa" w:w="100"/>
+            </w:tcMar>
+            <w:vAlign w:val="center"/>
+          </w:tcPr>
+          <w:p>
+            <w:pPr>
+              <w:jc w:val="center"/>
+            </w:pPr>
+            <w:r>
+              <w:rPr>
+                <w:rFonts w:ascii="Malgun Gothic" w:cs="Malgun Gothic" w:eastAsia="Malgun Gothic" w:hAnsi="Malgun Gothic"/>
+                <w:b/>
+                <w:bCs/>
+                <w:color w:val="FFFFFF"/>
+                <w:sz w:val="20"/>
+                <w:szCs w:val="20"/>
+              </w:rPr>
+              <w:t xml:space="preserve">의미</w:t>
+            </w:r>
+          </w:p>
+        </w:tc>
+      </w:tr>
+      <w:tr>
+        <w:tc>
+          <w:tcPr>
+            <w:tcW w:type="dxa" w:w="4513"/>
+            <w:tcBorders>
+              <w:top w:val="single" w:color="D5D8DC" w:sz="1"/>
+              <w:left w:val="single" w:color="D5D8DC" w:sz="1"/>
+              <w:bottom w:val="single" w:color="D5D8DC" w:sz="1"/>
+              <w:right w:val="single" w:color="D5D8DC" w:sz="1"/>
+            </w:tcBorders>
+            <w:tcMar>
+              <w:top w:type="dxa" w:w="60"/>
+              <w:left w:type="dxa" w:w="100"/>
+              <w:bottom w:type="dxa" w:w="60"/>
+              <w:right w:type="dxa" w:w="100"/>
+            </w:tcMar>
+          </w:tcPr>
+          <w:p>
+            <w:r>
+              <w:rPr>
+                <w:rFonts w:ascii="Malgun Gothic" w:cs="Malgun Gothic" w:eastAsia="Malgun Gothic" w:hAnsi="Malgun Gothic"/>
+                <w:sz w:val="20"/>
+                <w:szCs w:val="20"/>
+              </w:rPr>
+              <w:t xml:space="preserve">❌ 미설정 (NONE)</w:t>
+            </w:r>
+          </w:p>
+        </w:tc>
+        <w:tc>
+          <w:tcPr>
+            <w:tcW w:type="dxa" w:w="4513"/>
+            <w:tcBorders>
+              <w:top w:val="single" w:color="D5D8DC" w:sz="1"/>
+              <w:left w:val="single" w:color="D5D8DC" w:sz="1"/>
+              <w:bottom w:val="single" w:color="D5D8DC" w:sz="1"/>
+              <w:right w:val="single" w:color="D5D8DC" w:sz="1"/>
+            </w:tcBorders>
+            <w:tcMar>
+              <w:top w:type="dxa" w:w="60"/>
+              <w:left w:type="dxa" w:w="100"/>
+              <w:bottom w:type="dxa" w:w="60"/>
+              <w:right w:type="dxa" w:w="100"/>
+            </w:tcMar>
+          </w:tcPr>
+          <w:p>
+            <w:r>
+              <w:rPr>
+                <w:rFonts w:ascii="Malgun Gothic" w:cs="Malgun Gothic" w:eastAsia="Malgun Gothic" w:hAnsi="Malgun Gothic"/>
+                <w:sz w:val="20"/>
+                <w:szCs w:val="20"/>
+              </w:rPr>
+              <w:t xml:space="preserve">적립만 가능, 교환 불가 — 정책 결정까지 대기</w:t>
+            </w:r>
+          </w:p>
+        </w:tc>
+      </w:tr>
+      <w:tr>
+        <w:tc>
+          <w:tcPr>
+            <w:tcW w:type="dxa" w:w="4513"/>
+            <w:tcBorders>
+              <w:top w:val="single" w:color="D5D8DC" w:sz="1"/>
+              <w:left w:val="single" w:color="D5D8DC" w:sz="1"/>
+              <w:bottom w:val="single" w:color="D5D8DC" w:sz="1"/>
+              <w:right w:val="single" w:color="D5D8DC" w:sz="1"/>
+            </w:tcBorders>
+            <w:shd w:fill="F8F9FA" w:val="clear"/>
+            <w:tcMar>
+              <w:top w:type="dxa" w:w="60"/>
+              <w:left w:type="dxa" w:w="100"/>
+              <w:bottom w:type="dxa" w:w="60"/>
+              <w:right w:type="dxa" w:w="100"/>
+            </w:tcMar>
+          </w:tcPr>
+          <w:p>
+            <w:r>
+              <w:rPr>
+                <w:rFonts w:ascii="Malgun Gothic" w:cs="Malgun Gothic" w:eastAsia="Malgun Gothic" w:hAnsi="Malgun Gothic"/>
+                <w:sz w:val="20"/>
+                <w:szCs w:val="20"/>
+              </w:rPr>
+              <w:t xml:space="preserve">💰 청구액 차감만</w:t>
+            </w:r>
+          </w:p>
+        </w:tc>
+        <w:tc>
+          <w:tcPr>
+            <w:tcW w:type="dxa" w:w="4513"/>
+            <w:tcBorders>
+              <w:top w:val="single" w:color="D5D8DC" w:sz="1"/>
+              <w:left w:val="single" w:color="D5D8DC" w:sz="1"/>
+              <w:bottom w:val="single" w:color="D5D8DC" w:sz="1"/>
+              <w:right w:val="single" w:color="D5D8DC" w:sz="1"/>
+            </w:tcBorders>
+            <w:shd w:fill="F8F9FA" w:val="clear"/>
+            <w:tcMar>
+              <w:top w:type="dxa" w:w="60"/>
+              <w:left w:type="dxa" w:w="100"/>
+              <w:bottom w:type="dxa" w:w="60"/>
+              <w:right w:type="dxa" w:w="100"/>
+            </w:tcMar>
+          </w:tcPr>
+          <w:p>
+            <w:r>
+              <w:rPr>
+                <w:rFonts w:ascii="Malgun Gothic" w:cs="Malgun Gothic" w:eastAsia="Malgun Gothic" w:hAnsi="Malgun Gothic"/>
+                <w:sz w:val="20"/>
+                <w:szCs w:val="20"/>
+              </w:rPr>
+              <w:t xml:space="preserve">다음 IT 계약/매출 청구액에서 자동 차감만 가능</w:t>
+            </w:r>
+          </w:p>
+        </w:tc>
+      </w:tr>
+      <w:tr>
+        <w:tc>
+          <w:tcPr>
+            <w:tcW w:type="dxa" w:w="4513"/>
+            <w:tcBorders>
+              <w:top w:val="single" w:color="D5D8DC" w:sz="1"/>
+              <w:left w:val="single" w:color="D5D8DC" w:sz="1"/>
+              <w:bottom w:val="single" w:color="D5D8DC" w:sz="1"/>
+              <w:right w:val="single" w:color="D5D8DC" w:sz="1"/>
+            </w:tcBorders>
+            <w:tcMar>
+              <w:top w:type="dxa" w:w="60"/>
+              <w:left w:type="dxa" w:w="100"/>
+              <w:bottom w:type="dxa" w:w="60"/>
+              <w:right w:type="dxa" w:w="100"/>
+            </w:tcMar>
+          </w:tcPr>
+          <w:p>
+            <w:r>
+              <w:rPr>
+                <w:rFonts w:ascii="Malgun Gothic" w:cs="Malgun Gothic" w:eastAsia="Malgun Gothic" w:hAnsi="Malgun Gothic"/>
+                <w:sz w:val="20"/>
+                <w:szCs w:val="20"/>
+              </w:rPr>
+              <w:t xml:space="preserve">🎫 상품권만</w:t>
+            </w:r>
+          </w:p>
+        </w:tc>
+        <w:tc>
+          <w:tcPr>
+            <w:tcW w:type="dxa" w:w="4513"/>
+            <w:tcBorders>
+              <w:top w:val="single" w:color="D5D8DC" w:sz="1"/>
+              <w:left w:val="single" w:color="D5D8DC" w:sz="1"/>
+              <w:bottom w:val="single" w:color="D5D8DC" w:sz="1"/>
+              <w:right w:val="single" w:color="D5D8DC" w:sz="1"/>
+            </w:tcBorders>
+            <w:tcMar>
+              <w:top w:type="dxa" w:w="60"/>
+              <w:left w:type="dxa" w:w="100"/>
+              <w:bottom w:type="dxa" w:w="60"/>
+              <w:right w:type="dxa" w:w="100"/>
+            </w:tcMar>
+          </w:tcPr>
+          <w:p>
+            <w:r>
+              <w:rPr>
+                <w:rFonts w:ascii="Malgun Gothic" w:cs="Malgun Gothic" w:eastAsia="Malgun Gothic" w:hAnsi="Malgun Gothic"/>
+                <w:sz w:val="20"/>
+                <w:szCs w:val="20"/>
+              </w:rPr>
+              <w:t xml:space="preserve">기프티콘 수령만 가능</w:t>
+            </w:r>
+          </w:p>
+        </w:tc>
+      </w:tr>
+      <w:tr>
+        <w:tc>
+          <w:tcPr>
+            <w:tcW w:type="dxa" w:w="4513"/>
+            <w:tcBorders>
+              <w:top w:val="single" w:color="D5D8DC" w:sz="1"/>
+              <w:left w:val="single" w:color="D5D8DC" w:sz="1"/>
+              <w:bottom w:val="single" w:color="D5D8DC" w:sz="1"/>
+              <w:right w:val="single" w:color="D5D8DC" w:sz="1"/>
+            </w:tcBorders>
+            <w:shd w:fill="F8F9FA" w:val="clear"/>
+            <w:tcMar>
+              <w:top w:type="dxa" w:w="60"/>
+              <w:left w:type="dxa" w:w="100"/>
+              <w:bottom w:type="dxa" w:w="60"/>
+              <w:right w:type="dxa" w:w="100"/>
+            </w:tcMar>
+          </w:tcPr>
+          <w:p>
+            <w:r>
+              <w:rPr>
+                <w:rFonts w:ascii="Malgun Gothic" w:cs="Malgun Gothic" w:eastAsia="Malgun Gothic" w:hAnsi="Malgun Gothic"/>
+                <w:sz w:val="20"/>
+                <w:szCs w:val="20"/>
+              </w:rPr>
+              <w:t xml:space="preserve">✅ 둘 다</w:t>
+            </w:r>
+          </w:p>
+        </w:tc>
+        <w:tc>
+          <w:tcPr>
+            <w:tcW w:type="dxa" w:w="4513"/>
+            <w:tcBorders>
+              <w:top w:val="single" w:color="D5D8DC" w:sz="1"/>
+              <w:left w:val="single" w:color="D5D8DC" w:sz="1"/>
+              <w:bottom w:val="single" w:color="D5D8DC" w:sz="1"/>
+              <w:right w:val="single" w:color="D5D8DC" w:sz="1"/>
+            </w:tcBorders>
+            <w:shd w:fill="F8F9FA" w:val="clear"/>
+            <w:tcMar>
+              <w:top w:type="dxa" w:w="60"/>
+              <w:left w:type="dxa" w:w="100"/>
+              <w:bottom w:type="dxa" w:w="60"/>
+              <w:right w:type="dxa" w:w="100"/>
+            </w:tcMar>
+          </w:tcPr>
+          <w:p>
+            <w:r>
+              <w:rPr>
+                <w:rFonts w:ascii="Malgun Gothic" w:cs="Malgun Gothic" w:eastAsia="Malgun Gothic" w:hAnsi="Malgun Gothic"/>
+                <w:sz w:val="20"/>
+                <w:szCs w:val="20"/>
+              </w:rPr>
+              <w:t xml:space="preserve">신청 시 직접 선택 가능</w:t>
+            </w:r>
+          </w:p>
+        </w:tc>
+      </w:tr>
+    </w:tbl>
+    <w:p>
+      <w:pPr>
+        <w:spacing w:after="120"/>
+      </w:pPr>
+      <w:r>
+        <w:rPr>
+          <w:rFonts w:ascii="Malgun Gothic" w:cs="Malgun Gothic" w:eastAsia="Malgun Gothic" w:hAnsi="Malgun Gothic"/>
+          <w:sz w:val="22"/>
+          <w:szCs w:val="22"/>
+        </w:rPr>
+        <w:t xml:space="preserve">귀사의 정책은 사이드바 🏆 클릭 → 포인트 페이지에서 안내문으로 표시됩니다 ("계약상 사용 방식: 청구액 차감만"). 정책에 맞지 않는 옵션은 자동으로 숨김 처리됩니다.</w:t>
+      </w:r>
+    </w:p>
+    <w:p>
+      <w:pPr>
+        <w:pBdr>
+          <w:left w:val="single" w:color="E67E22" w:sz="8" w:space="8"/>
+        </w:pBdr>
+        <w:spacing w:after="120" w:before="80"/>
+        <w:ind w:left="360"/>
+      </w:pPr>
+      <w:r>
+        <w:rPr>
+          <w:rFonts w:ascii="Malgun Gothic" w:cs="Malgun Gothic" w:eastAsia="Malgun Gothic" w:hAnsi="Malgun Gothic"/>
+          <w:i/>
+          <w:iCs/>
+          <w:color w:val="7F8C8D"/>
+          <w:sz w:val="20"/>
+          <w:szCs w:val="20"/>
+        </w:rPr>
+        <w:t xml:space="preserve">정책 변경이 필요하시면 영업담당에게 문의해 주세요.</w:t>
       </w:r>
     </w:p>
     <w:p>
@@ -3734,7 +4204,7 @@
         <w:pStyle w:val="Heading1"/>
       </w:pPr>
       <w:r>
-        <w:t xml:space="preserve">5. 사용량 컨펌</w:t>
+        <w:t xml:space="preserve">5. 사용량 컨펌 (NEW — SNMP 자동수집 연동)</w:t>
       </w:r>
     </w:p>
     <w:p>
@@ -3747,7 +4217,186 @@
           <w:sz w:val="22"/>
           <w:szCs w:val="22"/>
         </w:rPr>
-        <w:t xml:space="preserve">IT(프린터·복합기) 월별 사용량(카운터)을 확인하고 청구 금액을 서명·컨펌합니다.</w:t>
+        <w:t xml:space="preserve">IT(프린터·복합기) 월별 사용량을 확인하고 서명·컨펌합니다.</w:t>
+      </w:r>
+    </w:p>
+    <w:p>
+      <w:pPr>
+        <w:pStyle w:val="Heading2"/>
+      </w:pPr>
+      <w:r>
+        <w:t xml:space="preserve">새 워크플로 (2026-04 부터)</w:t>
+      </w:r>
+    </w:p>
+    <w:p>
+      <w:pPr>
+        <w:spacing w:after="120"/>
+      </w:pPr>
+      <w:r>
+        <w:rPr>
+          <w:rFonts w:ascii="Malgun Gothic" w:cs="Malgun Gothic" w:eastAsia="Malgun Gothic" w:hAnsi="Malgun Gothic"/>
+          <w:sz w:val="22"/>
+          <w:szCs w:val="22"/>
+        </w:rPr>
+        <w:t xml:space="preserve">기존: 관리자가 수동으로 카운터 입력 → 청구 발행 신규: 에이전트가 매월 자동 수집 → 사용량 확인서(UC) 자동 생성 → 알림 → 고객 서명 → PDF → 매출</w:t>
+      </w:r>
+    </w:p>
+    <w:p>
+      <w:pPr>
+        <w:pStyle w:val="Heading3"/>
+      </w:pPr>
+      <w:r>
+        <w:t xml:space="preserve">자동 수집 흐름</w:t>
+      </w:r>
+    </w:p>
+    <w:p>
+      <w:pPr>
+        <w:pStyle w:val="ListParagraph"/>
+        <w:numPr>
+          <w:ilvl w:val="0"/>
+          <w:numId w:val="3"/>
+        </w:numPr>
+        <w:spacing w:after="60"/>
+      </w:pPr>
+      <w:r>
+        <w:rPr>
+          <w:rFonts w:ascii="Malgun Gothic" w:cs="Malgun Gothic" w:eastAsia="Malgun Gothic" w:hAnsi="Malgun Gothic"/>
+          <w:sz w:val="22"/>
+          <w:szCs w:val="22"/>
+        </w:rPr>
+        <w:t xml:space="preserve">매월 [수집일] (계약마다 다름, 기본 25일) 에 사무실 PC 에 설치된 에이전트가 SNMP 카운터 자동 수집</w:t>
+      </w:r>
+    </w:p>
+    <w:p>
+      <w:pPr>
+        <w:pStyle w:val="ListParagraph"/>
+        <w:numPr>
+          <w:ilvl w:val="0"/>
+          <w:numId w:val="3"/>
+        </w:numPr>
+        <w:spacing w:after="60"/>
+      </w:pPr>
+      <w:r>
+        <w:rPr>
+          <w:rFonts w:ascii="Malgun Gothic" w:cs="Malgun Gothic" w:eastAsia="Malgun Gothic" w:hAnsi="Malgun Gothic"/>
+          <w:sz w:val="22"/>
+          <w:szCs w:val="22"/>
+        </w:rPr>
+        <w:t xml:space="preserve">ERP가 「사용량 확인서 (UC-YYMMDD-###)」 자동 생성 (status=COLLECTED)</w:t>
+      </w:r>
+    </w:p>
+    <w:p>
+      <w:pPr>
+        <w:pStyle w:val="ListParagraph"/>
+        <w:numPr>
+          <w:ilvl w:val="0"/>
+          <w:numId w:val="3"/>
+        </w:numPr>
+        <w:spacing w:after="60"/>
+      </w:pPr>
+      <w:r>
+        <w:rPr>
+          <w:rFonts w:ascii="Malgun Gothic" w:cs="Malgun Gothic" w:eastAsia="Malgun Gothic" w:hAnsi="Malgun Gothic"/>
+          <w:sz w:val="22"/>
+          <w:szCs w:val="22"/>
+        </w:rPr>
+        <w:t xml:space="preserve">다음날 03:00 KST cron 이 고객에게 알림 발송 (status=CUSTOMER_NOTIFIED)</w:t>
+      </w:r>
+    </w:p>
+    <w:p>
+      <w:pPr>
+        <w:pStyle w:val="ListParagraph"/>
+        <w:numPr>
+          <w:ilvl w:val="0"/>
+          <w:numId w:val="3"/>
+        </w:numPr>
+        <w:spacing w:after="60"/>
+      </w:pPr>
+      <w:r>
+        <w:rPr>
+          <w:rFonts w:ascii="Malgun Gothic" w:cs="Malgun Gothic" w:eastAsia="Malgun Gothic" w:hAnsi="Malgun Gothic"/>
+          <w:sz w:val="22"/>
+          <w:szCs w:val="22"/>
+        </w:rPr>
+        <w:t xml:space="preserve">포탈 사이드바 알림 + 메인 화면에 「확인 대기」 표시</w:t>
+      </w:r>
+    </w:p>
+    <w:p>
+      <w:pPr>
+        <w:pStyle w:val="ListParagraph"/>
+        <w:numPr>
+          <w:ilvl w:val="0"/>
+          <w:numId w:val="3"/>
+        </w:numPr>
+        <w:spacing w:after="60"/>
+      </w:pPr>
+      <w:r>
+        <w:rPr>
+          <w:rFonts w:ascii="Malgun Gothic" w:cs="Malgun Gothic" w:eastAsia="Malgun Gothic" w:hAnsi="Malgun Gothic"/>
+          <w:sz w:val="22"/>
+          <w:szCs w:val="22"/>
+        </w:rPr>
+        <w:t xml:space="preserve">고객 [확인하기] 클릭 → 장비별 사용량/요금 검토 → 서명 → 확정 (status=CUSTOMER_CONFIRMED)</w:t>
+      </w:r>
+    </w:p>
+    <w:p>
+      <w:pPr>
+        <w:pStyle w:val="ListParagraph"/>
+        <w:numPr>
+          <w:ilvl w:val="0"/>
+          <w:numId w:val="3"/>
+        </w:numPr>
+        <w:spacing w:after="60"/>
+      </w:pPr>
+      <w:r>
+        <w:rPr>
+          <w:rFonts w:ascii="Malgun Gothic" w:cs="Malgun Gothic" w:eastAsia="Malgun Gothic" w:hAnsi="Malgun Gothic"/>
+          <w:sz w:val="22"/>
+          <w:szCs w:val="22"/>
+        </w:rPr>
+        <w:t xml:space="preserve">관리자 검토 → PDF 생성 → 매출 전표 발행 → 미수금 자동 발생</w:t>
+      </w:r>
+    </w:p>
+    <w:p>
+      <w:pPr>
+        <w:pStyle w:val="Heading3"/>
+      </w:pPr>
+      <w:r>
+        <w:t xml:space="preserve">신규 화면 — 장비별 상세 카드</w:t>
+      </w:r>
+    </w:p>
+    <w:p>
+      <w:pPr>
+        <w:spacing w:after="120"/>
+      </w:pPr>
+      <w:r>
+        <w:rPr>
+          <w:rFonts w:ascii="Malgun Gothic" w:cs="Malgun Gothic" w:eastAsia="Malgun Gothic" w:hAnsi="Malgun Gothic"/>
+          <w:sz w:val="22"/>
+          <w:szCs w:val="22"/>
+        </w:rPr>
+        <w:t xml:space="preserve">각 IT 계약의 장비별로 개별 카드가 표시됩니다:</w:t>
+      </w:r>
+    </w:p>
+    <w:p>
+      <w:pPr>
+        <w:pStyle w:val="Heading3"/>
+      </w:pPr>
+      <w:r>
+        <w:t xml:space="preserve">⚠ 카운터 이상 감지</w:t>
+      </w:r>
+    </w:p>
+    <w:p>
+      <w:pPr>
+        <w:spacing w:after="120"/>
+      </w:pPr>
+      <w:r>
+        <w:rPr>
+          <w:rFonts w:ascii="Malgun Gothic" w:cs="Malgun Gothic" w:eastAsia="Malgun Gothic" w:hAnsi="Malgun Gothic"/>
+          <w:sz w:val="22"/>
+          <w:szCs w:val="22"/>
+        </w:rPr>
+        <w:t xml:space="preserve">값이 불자연스럽게 줄었거나(메인보드 교체 등) 0보다 작은 사용량이 계산되면 ⚠ 표시. 확인 전에 Tellustech 담당자에게 연락해 주세요.</w:t>
       </w:r>
     </w:p>
     <w:p>
@@ -11477,6 +12126,389 @@
           <w:szCs w:val="20"/>
         </w:rPr>
         <w:t xml:space="preserve">정확한 연락처는 담당자 명함 또는 계약서 첫 장을 참조해 주세요. 문서가 의심스러운 경로로 전달된 경우 반드시 직접 담당자에게 확인 후 사용해 주세요.</w:t>
+      </w:r>
+    </w:p>
+    <w:p>
+      <w:r>
+        <w:br w:type="page"/>
+      </w:r>
+    </w:p>
+    <w:p>
+      <w:pPr>
+        <w:pStyle w:val="Heading1"/>
+      </w:pPr>
+      <w:r>
+        <w:t xml:space="preserve">16. 다운로드 / 업로드 안내 (KH)</w:t>
+      </w:r>
+    </w:p>
+    <w:p>
+      <w:pPr>
+        <w:spacing w:after="120"/>
+      </w:pPr>
+      <w:r>
+        <w:rPr>
+          <w:rFonts w:ascii="Malgun Gothic" w:cs="Malgun Gothic" w:eastAsia="Malgun Gothic" w:hAnsi="Malgun Gothic"/>
+          <w:sz w:val="22"/>
+          <w:szCs w:val="22"/>
+        </w:rPr>
+        <w:t xml:space="preserve">본 절은 고객 포탈에서 사용자가 직접 받거나 올릴 수 있는 파일·문서를 정리합니다. 사내 ERP 의 일괄 업로드는 별도 (관리자 매뉴얼 참조).</w:t>
+      </w:r>
+    </w:p>
+    <w:p>
+      <w:pPr>
+        <w:pStyle w:val="Heading2"/>
+      </w:pPr>
+      <w:r>
+        <w:t xml:space="preserve">16.1 사용량 확인서 PDF 다운로드</w:t>
+      </w:r>
+    </w:p>
+    <w:p>
+      <w:pPr>
+        <w:spacing w:after="120"/>
+      </w:pPr>
+      <w:r>
+        <w:rPr>
+          <w:rFonts w:ascii="Malgun Gothic" w:cs="Malgun Gothic" w:eastAsia="Malgun Gothic" w:hAnsi="Malgun Gothic"/>
+          <w:sz w:val="22"/>
+          <w:szCs w:val="22"/>
+        </w:rPr>
+        <w:t xml:space="preserve">📍 경로: 「내 사용량 확인서」 메뉴 → 행의 「📄 PDF」 버튼.</w:t>
+      </w:r>
+    </w:p>
+    <w:p>
+      <w:pPr>
+        <w:spacing w:after="120"/>
+      </w:pPr>
+      <w:r>
+        <w:rPr>
+          <w:rFonts w:ascii="Malgun Gothic" w:cs="Malgun Gothic" w:eastAsia="Malgun Gothic" w:hAnsi="Malgun Gothic"/>
+          <w:sz w:val="22"/>
+          <w:szCs w:val="22"/>
+        </w:rPr>
+        <w:t xml:space="preserve">⚠️ 관리자가 PDF 생성 후에만 다운로드 가능. 「⬜ 수집완료」 상태에서는 아직 미생성 — 「🟡 알림됨」 시 본인 컨펌 후 며칠 내 PDF 가 만들어집니다.</w:t>
+      </w:r>
+    </w:p>
+    <w:p>
+      <w:pPr>
+        <w:spacing w:after="120"/>
+      </w:pPr>
+      <w:r>
+        <w:rPr>
+          <w:rFonts w:ascii="Malgun Gothic" w:cs="Malgun Gothic" w:eastAsia="Malgun Gothic" w:hAnsi="Malgun Gothic"/>
+          <w:sz w:val="22"/>
+          <w:szCs w:val="22"/>
+        </w:rPr>
+        <w:t xml:space="preserve">⚠️ PDF 에는 본인 서명 + 흑백/컬러 카운터 + 청구액이 임베드됩니다. 분실 주의.</w:t>
+      </w:r>
+    </w:p>
+    <w:p>
+      <w:pPr>
+        <w:spacing w:after="120"/>
+      </w:pPr>
+      <w:r>
+        <w:rPr>
+          <w:rFonts w:ascii="Malgun Gothic" w:cs="Malgun Gothic" w:eastAsia="Malgun Gothic" w:hAnsi="Malgun Gothic"/>
+          <w:sz w:val="22"/>
+          <w:szCs w:val="22"/>
+        </w:rPr>
+        <w:t xml:space="preserve">💡 꿀팁: 매월 PDF 를 회사 회계 폴더에 보관해 두면 미수금 정산·연말 결산 시 편리.</w:t>
+      </w:r>
+    </w:p>
+    <w:p>
+      <w:pPr>
+        <w:pStyle w:val="Heading2"/>
+      </w:pPr>
+      <w:r>
+        <w:t xml:space="preserve">16.2 견적·교정 성적서 다운로드</w:t>
+      </w:r>
+    </w:p>
+    <w:p>
+      <w:pPr>
+        <w:spacing w:after="120"/>
+      </w:pPr>
+      <w:r>
+        <w:rPr>
+          <w:rFonts w:ascii="Malgun Gothic" w:cs="Malgun Gothic" w:eastAsia="Malgun Gothic" w:hAnsi="Malgun Gothic"/>
+          <w:sz w:val="22"/>
+          <w:szCs w:val="22"/>
+        </w:rPr>
+        <w:t xml:space="preserve">📍 경로: 「내 견적」 또는 「렌탈 장비」 → 행의 첨부 파일 클릭.</w:t>
+      </w:r>
+    </w:p>
+    <w:p>
+      <w:pPr>
+        <w:spacing w:after="120"/>
+      </w:pPr>
+      <w:r>
+        <w:rPr>
+          <w:rFonts w:ascii="Malgun Gothic" w:cs="Malgun Gothic" w:eastAsia="Malgun Gothic" w:hAnsi="Malgun Gothic"/>
+          <w:sz w:val="22"/>
+          <w:szCs w:val="22"/>
+        </w:rPr>
+        <w:t xml:space="preserve">⚠️ 관리자가 등록한 PDF 만 보입니다. 매출 라인의 certPdf 필드 업로드 후 즉시 노출.</w:t>
+      </w:r>
+    </w:p>
+    <w:p>
+      <w:pPr>
+        <w:spacing w:after="120"/>
+      </w:pPr>
+      <w:r>
+        <w:rPr>
+          <w:rFonts w:ascii="Malgun Gothic" w:cs="Malgun Gothic" w:eastAsia="Malgun Gothic" w:hAnsi="Malgun Gothic"/>
+          <w:sz w:val="22"/>
+          <w:szCs w:val="22"/>
+        </w:rPr>
+        <w:t xml:space="preserve">💡 꿀팁: 베트남 정부 기관 제출용 교정 성적서는 PDF 그대로 인쇄해 사용 가능 (전자서명 포함).</w:t>
+      </w:r>
+    </w:p>
+    <w:p>
+      <w:pPr>
+        <w:pStyle w:val="Heading2"/>
+      </w:pPr>
+      <w:r>
+        <w:t xml:space="preserve">16.3 AS 사진 / 파일 업로드</w:t>
+      </w:r>
+    </w:p>
+    <w:p>
+      <w:pPr>
+        <w:spacing w:after="120"/>
+      </w:pPr>
+      <w:r>
+        <w:rPr>
+          <w:rFonts w:ascii="Malgun Gothic" w:cs="Malgun Gothic" w:eastAsia="Malgun Gothic" w:hAnsi="Malgun Gothic"/>
+          <w:sz w:val="22"/>
+          <w:szCs w:val="22"/>
+        </w:rPr>
+        <w:t xml:space="preserve">📍 경로: 「AS 요청」 → 신규 등록 폼 → 사진 첨부 영역.</w:t>
+      </w:r>
+    </w:p>
+    <w:p>
+      <w:pPr>
+        <w:spacing w:after="120"/>
+      </w:pPr>
+      <w:r>
+        <w:rPr>
+          <w:rFonts w:ascii="Malgun Gothic" w:cs="Malgun Gothic" w:eastAsia="Malgun Gothic" w:hAnsi="Malgun Gothic"/>
+          <w:sz w:val="22"/>
+          <w:szCs w:val="22"/>
+        </w:rPr>
+        <w:t xml:space="preserve">⚠️ 모바일 카메라 권장. 폰에서 직접 찍으면 자동 회전 보정·압축됨. PC에서 다른 폴더 거쳐 올리면 회전이 어긋날 수 있음.</w:t>
+      </w:r>
+    </w:p>
+    <w:p>
+      <w:pPr>
+        <w:spacing w:after="120"/>
+      </w:pPr>
+      <w:r>
+        <w:rPr>
+          <w:rFonts w:ascii="Malgun Gothic" w:cs="Malgun Gothic" w:eastAsia="Malgun Gothic" w:hAnsi="Malgun Gothic"/>
+          <w:sz w:val="22"/>
+          <w:szCs w:val="22"/>
+        </w:rPr>
+        <w:t xml:space="preserve">⚠️ 포맷: JPEG / PNG / PDF. iPhone HEIC 형식은 미지원 — 폰 카메라 설정에서 「가장 호환 가능한 형식」 선택.</w:t>
+      </w:r>
+    </w:p>
+    <w:p>
+      <w:pPr>
+        <w:spacing w:after="120"/>
+      </w:pPr>
+      <w:r>
+        <w:rPr>
+          <w:rFonts w:ascii="Malgun Gothic" w:cs="Malgun Gothic" w:eastAsia="Malgun Gothic" w:hAnsi="Malgun Gothic"/>
+          <w:sz w:val="22"/>
+          <w:szCs w:val="22"/>
+        </w:rPr>
+        <w:t xml:space="preserve">⚠️ 크기: 단일 파일 10MB 이하 권장. 그 이상은 자동 압축 안 되므로 폰에서 줄여서 첨부.</w:t>
+      </w:r>
+    </w:p>
+    <w:p>
+      <w:pPr>
+        <w:spacing w:after="120"/>
+      </w:pPr>
+      <w:r>
+        <w:rPr>
+          <w:rFonts w:ascii="Malgun Gothic" w:cs="Malgun Gothic" w:eastAsia="Malgun Gothic" w:hAnsi="Malgun Gothic"/>
+          <w:sz w:val="22"/>
+          <w:szCs w:val="22"/>
+        </w:rPr>
+        <w:t xml:space="preserve">💡 꿀팁:</w:t>
+      </w:r>
+    </w:p>
+    <w:p>
+      <w:pPr>
+        <w:pStyle w:val="ListParagraph"/>
+        <w:numPr>
+          <w:ilvl w:val="0"/>
+          <w:numId w:val="2"/>
+        </w:numPr>
+        <w:spacing w:after="60"/>
+      </w:pPr>
+      <w:r>
+        <w:rPr>
+          <w:rFonts w:ascii="Malgun Gothic" w:cs="Malgun Gothic" w:eastAsia="Malgun Gothic" w:hAnsi="Malgun Gothic"/>
+          <w:sz w:val="22"/>
+          <w:szCs w:val="22"/>
+        </w:rPr>
+        <w:t xml:space="preserve">제품 라벨(S/N) + 고장 부위 사진 2~3장이면 충분. 기사가 출동 전 미리 부품 준비 가능 → 1회 출동 해결률 ↑.</w:t>
+      </w:r>
+    </w:p>
+    <w:p>
+      <w:pPr>
+        <w:pStyle w:val="ListParagraph"/>
+        <w:numPr>
+          <w:ilvl w:val="0"/>
+          <w:numId w:val="2"/>
+        </w:numPr>
+        <w:spacing w:after="60"/>
+      </w:pPr>
+      <w:r>
+        <w:rPr>
+          <w:rFonts w:ascii="Malgun Gothic" w:cs="Malgun Gothic" w:eastAsia="Malgun Gothic" w:hAnsi="Malgun Gothic"/>
+          <w:sz w:val="22"/>
+          <w:szCs w:val="22"/>
+        </w:rPr>
+        <w:t xml:space="preserve">영상 파일은 미지원. 동작 불량은 사진 + 텍스트 설명으로.</w:t>
+      </w:r>
+    </w:p>
+    <w:p>
+      <w:pPr>
+        <w:pStyle w:val="Heading2"/>
+      </w:pPr>
+      <w:r>
+        <w:t xml:space="preserve">16.4 소모품 요청 — 첨부 없음</w:t>
+      </w:r>
+    </w:p>
+    <w:p>
+      <w:pPr>
+        <w:spacing w:after="120"/>
+      </w:pPr>
+      <w:r>
+        <w:rPr>
+          <w:rFonts w:ascii="Malgun Gothic" w:cs="Malgun Gothic" w:eastAsia="Malgun Gothic" w:hAnsi="Malgun Gothic"/>
+          <w:sz w:val="22"/>
+          <w:szCs w:val="22"/>
+        </w:rPr>
+        <w:t xml:space="preserve">📍 「내 IT 계약」 → 「소모품 요청」 메뉴.</w:t>
+      </w:r>
+    </w:p>
+    <w:p>
+      <w:pPr>
+        <w:spacing w:after="120"/>
+      </w:pPr>
+      <w:r>
+        <w:rPr>
+          <w:rFonts w:ascii="Malgun Gothic" w:cs="Malgun Gothic" w:eastAsia="Malgun Gothic" w:hAnsi="Malgun Gothic"/>
+          <w:sz w:val="22"/>
+          <w:szCs w:val="22"/>
+        </w:rPr>
+        <w:t xml:space="preserve">소모품 요청은 텍스트 입력만. 사진·파일 첨부 불필요. 호환되는 소모품 목록에서 선택만 하면 됩니다.</w:t>
+      </w:r>
+    </w:p>
+    <w:p>
+      <w:pPr>
+        <w:spacing w:after="120"/>
+      </w:pPr>
+      <w:r>
+        <w:rPr>
+          <w:rFonts w:ascii="Malgun Gothic" w:cs="Malgun Gothic" w:eastAsia="Malgun Gothic" w:hAnsi="Malgun Gothic"/>
+          <w:sz w:val="22"/>
+          <w:szCs w:val="22"/>
+        </w:rPr>
+        <w:t xml:space="preserve">💡 꿀팁: 「장비별 좁혀보기」 셀렉트로 본인 장비에 맞는 소모품만 표시 가능. 특히 여러 모델 보유 시 편리.</w:t>
+      </w:r>
+    </w:p>
+    <w:p>
+      <w:pPr>
+        <w:pStyle w:val="Heading2"/>
+      </w:pPr>
+      <w:r>
+        <w:t xml:space="preserve">16.5 메뉴 / 화면 캡처 (사용자 직접)</w:t>
+      </w:r>
+    </w:p>
+    <w:p>
+      <w:pPr>
+        <w:spacing w:after="120"/>
+      </w:pPr>
+      <w:r>
+        <w:rPr>
+          <w:rFonts w:ascii="Malgun Gothic" w:cs="Malgun Gothic" w:eastAsia="Malgun Gothic" w:hAnsi="Malgun Gothic"/>
+          <w:sz w:val="22"/>
+          <w:szCs w:val="22"/>
+        </w:rPr>
+        <w:t xml:space="preserve">ERP 측에서 제공하는 다운로드는 위 3종(PDF·성적서·AS 사진 reverse)뿐. 다른 화면(포인트 이력·렌탈 현황 등)을 백업해 두려면:</w:t>
+      </w:r>
+    </w:p>
+    <w:p>
+      <w:pPr>
+        <w:spacing w:after="120"/>
+      </w:pPr>
+      <w:r>
+        <w:rPr>
+          <w:rFonts w:ascii="Malgun Gothic" w:cs="Malgun Gothic" w:eastAsia="Malgun Gothic" w:hAnsi="Malgun Gothic"/>
+          <w:sz w:val="22"/>
+          <w:szCs w:val="22"/>
+        </w:rPr>
+        <w:t xml:space="preserve">💡 꿀팁: PWA 설치 후 모바일 「캡처」 또는 PC 브라우저 인쇄 기능 → PDF 저장. 사이드바·헤더는 자동 숨김 (PWA 인쇄 모드).</w:t>
+      </w:r>
+    </w:p>
+    <w:p>
+      <w:pPr>
+        <w:pStyle w:val="Heading2"/>
+      </w:pPr>
+      <w:r>
+        <w:t xml:space="preserve">16.6 보안 안내</w:t>
+      </w:r>
+    </w:p>
+    <w:p>
+      <w:pPr>
+        <w:spacing w:after="120"/>
+      </w:pPr>
+      <w:r>
+        <w:rPr>
+          <w:rFonts w:ascii="Malgun Gothic" w:cs="Malgun Gothic" w:eastAsia="Malgun Gothic" w:hAnsi="Malgun Gothic"/>
+          <w:sz w:val="22"/>
+          <w:szCs w:val="22"/>
+        </w:rPr>
+        <w:t xml:space="preserve">⚠️ PDF·사진 파일은 본인 거래처 데이터만 다운로드 가능. 다른 거래처 데이터에 접근 시 401/403 거절.</w:t>
+      </w:r>
+    </w:p>
+    <w:p>
+      <w:pPr>
+        <w:spacing w:after="120"/>
+      </w:pPr>
+      <w:r>
+        <w:rPr>
+          <w:rFonts w:ascii="Malgun Gothic" w:cs="Malgun Gothic" w:eastAsia="Malgun Gothic" w:hAnsi="Malgun Gothic"/>
+          <w:sz w:val="22"/>
+          <w:szCs w:val="22"/>
+        </w:rPr>
+        <w:t xml:space="preserve">⚠️ 포탈 비밀번호 변경 후 PDF 다운로드 링크는 그대로 유효 (URL 기반 인증 X — 세션 쿠키 기반).</w:t>
+      </w:r>
+    </w:p>
+    <w:p>
+      <w:pPr>
+        <w:spacing w:after="120"/>
+      </w:pPr>
+      <w:r>
+        <w:rPr>
+          <w:rFonts w:ascii="Malgun Gothic" w:cs="Malgun Gothic" w:eastAsia="Malgun Gothic" w:hAnsi="Malgun Gothic"/>
+          <w:sz w:val="22"/>
+          <w:szCs w:val="22"/>
+        </w:rPr>
+        <w:t xml:space="preserve">⚠️ 사진을 외부에 공유할 때 S/N·자산코드가 보일 수 있음. 회사 자산 정보 노출에 주의.</w:t>
+      </w:r>
+    </w:p>
+    <w:p>
+      <w:pPr>
+        <w:spacing w:after="120"/>
+      </w:pPr>
+      <w:r>
+        <w:rPr>
+          <w:rFonts w:ascii="Malgun Gothic" w:cs="Malgun Gothic" w:eastAsia="Malgun Gothic" w:hAnsi="Malgun Gothic"/>
+          <w:sz w:val="22"/>
+          <w:szCs w:val="22"/>
+        </w:rPr>
+        <w:t xml:space="preserve">💡 꿀팁: 분실 의심 시 즉시 「비밀번호 변경」 → 모든 기존 세션 자동 만료.</w:t>
       </w:r>
     </w:p>
     <w:sectPr>

</xml_diff>